<commit_message>
Use double line spacing per lecturer guidelines
Co-Authored-By: Claude Fable 5 <noreply@anthropic.com>
Claude-Session: https://claude.ai/code/session_01LZ7xYFTnZwnjLMGr5jfq5N
</commit_message>
<xml_diff>
--- a/רביע אלטורי - תרגיל 1+2 - מבוא לסוציולוגיה.docx
+++ b/רביע אלטורי - תרגיל 1+2 - מבוא לסוציולוגיה.docx
@@ -5,7 +5,7 @@
     <w:p>
       <w:pPr>
         <w:bidi w:val="1"/>
-        <w:spacing w:line="360" w:lineRule="auto" w:before="480" w:after="0"/>
+        <w:spacing w:line="480" w:lineRule="auto" w:before="480" w:after="0"/>
         <w:jc w:val="center"/>
       </w:pPr>
       <w:r>
@@ -23,7 +23,7 @@
     <w:p>
       <w:pPr>
         <w:bidi w:val="1"/>
-        <w:spacing w:line="360" w:lineRule="auto" w:before="0" w:after="0"/>
+        <w:spacing w:line="480" w:lineRule="auto" w:before="0" w:after="0"/>
         <w:jc w:val="center"/>
       </w:pPr>
       <w:r>
@@ -40,7 +40,7 @@
     <w:p>
       <w:pPr>
         <w:bidi w:val="1"/>
-        <w:spacing w:line="360" w:lineRule="auto" w:before="0" w:after="0"/>
+        <w:spacing w:line="480" w:lineRule="auto" w:before="0" w:after="0"/>
         <w:jc w:val="center"/>
       </w:pPr>
       <w:r>
@@ -57,7 +57,7 @@
     <w:p>
       <w:pPr>
         <w:bidi w:val="1"/>
-        <w:spacing w:line="360" w:lineRule="auto" w:before="0" w:after="960"/>
+        <w:spacing w:line="480" w:lineRule="auto" w:before="0" w:after="960"/>
         <w:jc w:val="center"/>
       </w:pPr>
       <w:r>
@@ -74,7 +74,7 @@
     <w:p>
       <w:pPr>
         <w:bidi w:val="1"/>
-        <w:spacing w:line="360" w:lineRule="auto" w:before="0" w:after="240"/>
+        <w:spacing w:line="480" w:lineRule="auto" w:before="0" w:after="240"/>
         <w:jc w:val="center"/>
       </w:pPr>
       <w:r>
@@ -92,7 +92,7 @@
     <w:p>
       <w:pPr>
         <w:bidi w:val="1"/>
-        <w:spacing w:line="360" w:lineRule="auto" w:before="0" w:after="1200"/>
+        <w:spacing w:line="480" w:lineRule="auto" w:before="0" w:after="1200"/>
         <w:jc w:val="center"/>
       </w:pPr>
       <w:r>
@@ -110,7 +110,7 @@
     <w:p>
       <w:pPr>
         <w:bidi w:val="1"/>
-        <w:spacing w:line="360" w:lineRule="auto" w:before="0" w:after="0"/>
+        <w:spacing w:line="480" w:lineRule="auto" w:before="0" w:after="0"/>
         <w:jc w:val="center"/>
       </w:pPr>
       <w:r>
@@ -127,7 +127,7 @@
     <w:p>
       <w:pPr>
         <w:bidi w:val="1"/>
-        <w:spacing w:line="360" w:lineRule="auto" w:before="0" w:after="720"/>
+        <w:spacing w:line="480" w:lineRule="auto" w:before="0" w:after="720"/>
         <w:jc w:val="center"/>
       </w:pPr>
       <w:r>
@@ -144,7 +144,7 @@
     <w:p>
       <w:pPr>
         <w:bidi w:val="1"/>
-        <w:spacing w:line="360" w:lineRule="auto" w:before="0" w:after="0"/>
+        <w:spacing w:line="480" w:lineRule="auto" w:before="0" w:after="0"/>
         <w:jc w:val="center"/>
       </w:pPr>
       <w:r>
@@ -161,7 +161,7 @@
     <w:p>
       <w:pPr>
         <w:bidi w:val="1"/>
-        <w:spacing w:line="360" w:lineRule="auto" w:before="0" w:after="0"/>
+        <w:spacing w:line="480" w:lineRule="auto" w:before="0" w:after="0"/>
         <w:jc w:val="center"/>
       </w:pPr>
       <w:r>
@@ -183,7 +183,7 @@
     <w:p>
       <w:pPr>
         <w:bidi w:val="1"/>
-        <w:spacing w:line="360" w:lineRule="auto" w:before="0" w:after="200"/>
+        <w:spacing w:line="480" w:lineRule="auto" w:before="0" w:after="200"/>
         <w:jc w:val="right"/>
       </w:pPr>
       <w:r>
@@ -201,7 +201,7 @@
     <w:p>
       <w:pPr>
         <w:bidi w:val="1"/>
-        <w:spacing w:line="360" w:lineRule="auto" w:before="0" w:after="160"/>
+        <w:spacing w:line="480" w:lineRule="auto" w:before="0" w:after="0"/>
         <w:jc w:val="both"/>
       </w:pPr>
       <w:r>
@@ -212,13 +212,13 @@
           <w:rtl/>
           <w:szCs w:val="24"/>
         </w:rPr>
-        <w:t>בחורף לפני עשר שנים בערך, הייתי אז בן שתים עשרה, סבא שלי קרא לי לשבת לידו בשיג, אוהל האירוח של המשפחה. עד אז נכנסתי לשם רק כדי להביא משהו או לקרוא למישהו, כי ילדים לא יושבים עם הגברים. באותו ערב התארחו אצלנו קרובים מהמשפחה של דוד שלי, אולי חמישה עשר גברים, ובחוץ היה קר וחשוך. בפנים בערה אש קטנה בתוך גומה של חול, ולידה עמד הדלה, קנקן הקפה השחור והגבוה שאני מכיר מאז שאני זוכר את עצמי.</w:t>
+        <w:t>בחורף לפני עשר שנים בערך, הייתי אז בן שתים עשרה, סבא שלי קרא לי לשבת לידו בשיג, אוהל האירוח של המשפחה. עד אז נכנסתי לשם רק כדי להביא משהו או לקרוא למישהו, כי ילדים לא יושבים עם הגברים. באותו ערב התארחו אצלנו קרובים מהמשפחה של דוד שלי, אולי חמישה עשר גברים, ובחוץ היה קר וחשוך. בפנים בערה אש קטנה בתוך גומה של חול, ולידה עמד הדלה, קנקן הקפה השחור.</w:t>
       </w:r>
     </w:p>
     <w:p>
       <w:pPr>
         <w:bidi w:val="1"/>
-        <w:spacing w:line="360" w:lineRule="auto" w:before="0" w:after="160"/>
+        <w:spacing w:line="480" w:lineRule="auto" w:before="0" w:after="0"/>
         <w:jc w:val="both"/>
       </w:pPr>
       <w:r>
@@ -235,7 +235,7 @@
     <w:p>
       <w:pPr>
         <w:bidi w:val="1"/>
-        <w:spacing w:line="360" w:lineRule="auto" w:before="0" w:after="160"/>
+        <w:spacing w:line="480" w:lineRule="auto" w:before="0" w:after="0"/>
         <w:jc w:val="both"/>
       </w:pPr>
       <w:r>
@@ -252,7 +252,7 @@
     <w:p>
       <w:pPr>
         <w:bidi w:val="1"/>
-        <w:spacing w:line="360" w:lineRule="auto" w:before="0" w:after="160"/>
+        <w:spacing w:line="480" w:lineRule="auto" w:before="0" w:after="0"/>
         <w:jc w:val="both"/>
       </w:pPr>
       <w:r>
@@ -263,7 +263,7 @@
           <w:rtl/>
           <w:szCs w:val="24"/>
         </w:rPr>
-        <w:t>עברתי בין האנשים והלב דפק לי חזק. פחדתי לשפוך, פחדתי להתחיל מהאיש הלא נכון, פחדתי שכולם רואים שהיד שלי רועדת. ואז זקן אחד, חבר ותיק של סבא, לקח ממני את הספל, הביט בי רגע ארוך ואמר לסבא: "הנכד שלך כבר גבר". כולם צחקו, הפנים שלי בערו, אבל בפנים הרגשתי גאווה שקשה לי לתאר במילים. כשהאורחים הלכו, סבא הניח לי יד על הכתף ולא אמר כלום. זה היה מספיק.</w:t>
+        <w:t>עברתי בין האנשים והלב דפק לי חזק. פחדתי לשפוך, פחדתי להתחיל מהאיש הלא נכון. ואז זקן אחד, חבר ותיק של סבא, לקח ממני את הספל, הביט בי רגע ארוך ואמר לסבא: "הנכד שלך כבר גבר". כולם צחקו, הפנים שלי בערו, אבל בפנים הרגשתי גאווה שקשה לי לתאר במילים. כשהאורחים הלכו, סבא הניח לי יד על הכתף ולא אמר כלום. זה היה מספיק.</w:t>
       </w:r>
     </w:p>
     <w:p>
@@ -274,7 +274,7 @@
     <w:p>
       <w:pPr>
         <w:bidi w:val="1"/>
-        <w:spacing w:line="360" w:lineRule="auto" w:before="0" w:after="200"/>
+        <w:spacing w:line="480" w:lineRule="auto" w:before="0" w:after="200"/>
         <w:jc w:val="right"/>
       </w:pPr>
       <w:r>
@@ -292,7 +292,7 @@
     <w:p>
       <w:pPr>
         <w:bidi w:val="1"/>
-        <w:spacing w:line="360" w:lineRule="auto" w:before="0" w:after="160"/>
+        <w:spacing w:line="480" w:lineRule="auto" w:before="0" w:after="0"/>
         <w:jc w:val="both"/>
       </w:pPr>
       <w:r>
@@ -303,13 +303,13 @@
           <w:rtl/>
           <w:szCs w:val="24"/>
         </w:rPr>
-        <w:t>בתרגיל הראשון תיארתי את הערב שבו סבי הזמין אותי, בגיל שתים עשרה, למזוג לראשונה קפה לאורחים בשיג המשפחתי. תיארתי את קליית הפולים וכתישתם, את כללי המזיגה המדויקים שסבי לחש לי, את הפחד שלי לטעות מול האורחים, ואת הרגע שבו אחד הזקנים אמר עליי שאני "כבר גבר". באותו ערב חוויתי את המעמד כרגע אישי ומשפחתי מרגש. אבל כשאני מתבונן בו היום במבט סוציולוגי, אני מבין שהתרחש שם הרבה יותר מכוס קפה.</w:t>
+        <w:t>בתרגיל הראשון תיארתי את הערב שבו סבי הזמין אותי, בגיל שתים עשרה, למזוג לראשונה קפה לאורחים בשיג המשפחתי. תיארתי את קליית הפולים, את כללי המזיגה שסבי לחש לי, את הפחד לטעות, ואת הרגע שבו אחד הזקנים אמר עליי שאני "כבר גבר". באותו ערב חוויתי את המעמד כרגע אישי ומשפחתי מרגש. אבל כשאני מתבונן בו היום במבט סוציולוגי, אני מבין שהתרחש שם הרבה יותר מכוס קפה.</w:t>
       </w:r>
     </w:p>
     <w:p>
       <w:pPr>
         <w:bidi w:val="1"/>
-        <w:spacing w:line="360" w:lineRule="auto" w:before="0" w:after="160"/>
+        <w:spacing w:line="480" w:lineRule="auto" w:before="0" w:after="0"/>
         <w:jc w:val="both"/>
       </w:pPr>
       <w:r>
@@ -320,13 +320,13 @@
           <w:rtl/>
           <w:szCs w:val="24"/>
         </w:rPr>
-        <w:t>בחרתי לנתח את המקרה בעזרת שני מושגים שלמדנו: חיברות ונורמות תרבותיות. חיברות (סוציאליזציה) היא תהליך הלמידה החברתי שבו האדם רוכש את הערכים, הכללים ודפוסי ההתנהגות של החברה שהוא חי בה, וכך הופך מיצור ביולוגי לחבר מלא בקבוצה. התהליך הזה מתרחש דרך סוכני חיברות, ובראשם המשפחה. המושג השני קשור לתרבות: תרבות היא מכלול הידע, האמונות, המנהגים והסמלים שבאמצעותם קבוצה יוצרת משמעות משותפת, ונורמות הן כללי ההתנהגות המעשיים שמתרגמים ערכים מופשטים, כמו כבוד או הכנסת אורחים, למעשים יומיומיים. חשוב לי לציין שנורמה אינה מובנת מאליה. מה שנחשב מנומס בתרבות אחת יכול להיחשב פוגע בתרבות אחרת.</w:t>
+        <w:t>בחרתי לנתח את המקרה בעזרת שני מושגים שלמדנו: חיברות ונורמות תרבותיות. חיברות (סוציאליזציה) היא תהליך הלמידה החברתי שבו האדם רוכש את הערכים, הכללים ודפוסי ההתנהגות של החברה שהוא חי בה, וכך הופך מיצור ביולוגי לחבר מלא בקבוצה. התהליך הזה מתרחש דרך סוכני חיברות, ובראשם המשפחה. המושג השני קשור לתרבות: תרבות היא מכלול הידע, האמונות, המנהגים והסמלים שבאמצעותם קבוצה יוצרת משמעות משותפת, ונורמות הן כללי ההתנהגות המעשיים שמתרגמים ערכים מופשטים, כמו כבוד או הכנסת אורחים, למעשים יומיומיים.</w:t>
       </w:r>
     </w:p>
     <w:p>
       <w:pPr>
         <w:bidi w:val="1"/>
-        <w:spacing w:line="360" w:lineRule="auto" w:before="0" w:after="160"/>
+        <w:spacing w:line="480" w:lineRule="auto" w:before="0" w:after="0"/>
         <w:jc w:val="both"/>
       </w:pPr>
       <w:r>
@@ -337,7 +337,7 @@
           <w:rtl/>
           <w:szCs w:val="24"/>
         </w:rPr>
-        <w:t>כשמחברים את המושגים לסיפור, מתברר שהערב ההוא היה בעצם שיעור. סבי פעל כסוכן חיברות: הוא לא רק לימד אותי טכניקה של מזיגה, אלא העביר לי, בלחש וליד האש, את הערכים של החברה הבדואית שגדלתי בה, כבוד לזקנים, הכנסת אורחים, ומקומו של כל אדם במעגל. כללי המזיגה עצמם הם נורמות תרבותיות לכל דבר: היד שמחזיקה את הדלה, הכמות שנמזגת, הסדר שבו ניגשים לאורחים. ספל מלא נחשב עלבון לא בגלל משהו טבעי בקפה, אלא בגלל משמעות שהקבוצה העניקה לו, וזה בדיוק מה שהופך אותו לסמל תרבותי. גם המשפט "הנכד שלך כבר גבר" היה יותר ממחמאה. הוא היה אישור פומבי של הקבוצה לכך שעברתי בהצלחה שלב בתהליך החיברות שלי כגבר צעיר בחברה. מה שהרגשתי אז כגאווה אישית היה, בהקשר החברתי הרחב, הדרך שבה החברה שלי משכפלת את עצמה ומעבירה את סדריה מדור לדור.</w:t>
+        <w:t>כשמחברים את המושגים לסיפור, מתברר שהערב ההוא היה בעצם שיעור. סבי פעל כסוכן חיברות: הוא לא רק לימד אותי טכניקה של מזיגה, אלא העביר לי את הערכים של החברה הבדואית שגדלתי בה: כבוד לזקנים, הכנסת אורחים, ומקומו של כל אדם במעגל. כללי המזיגה עצמם הם נורמות תרבותיות: היד שמחזיקה את הדלה, הכמות שנמזגת, הסדר שבו ניגשים לאורחים. ספל מלא נחשב עלבון לא בגלל משהו טבעי בקפה, אלא בגלל משמעות שהקבוצה העניקה לו, ולכן הוא סמל תרבותי. גם המשפט "הנכד שלך כבר גבר" היה יותר ממחמאה. הוא היה אישור פומבי של הקבוצה לכך שעברתי שלב בתהליך החיברות שלי. מה שהרגשתי אז כגאווה אישית היה בעצם הדרך שבה החברה שלי משכפלת את עצמה ומעבירה את סדריה מדור לדור.</w:t>
       </w:r>
     </w:p>
     <w:sectPr>

</xml_diff>

<commit_message>
Expand both exercises to ~400 words each
Co-Authored-By: Claude Fable 5 <noreply@anthropic.com>
Claude-Session: https://claude.ai/code/session_01LZ7xYFTnZwnjLMGr5jfq5N
</commit_message>
<xml_diff>
--- a/רביע אלטורי - תרגיל 1+2 - מבוא לסוציולוגיה.docx
+++ b/רביע אלטורי - תרגיל 1+2 - מבוא לסוציולוגיה.docx
@@ -183,7 +183,7 @@
     <w:p>
       <w:pPr>
         <w:bidi w:val="1"/>
-        <w:spacing w:line="480" w:lineRule="auto" w:before="0" w:after="200"/>
+        <w:spacing w:line="480" w:lineRule="auto" w:before="0" w:after="120"/>
         <w:jc w:val="right"/>
       </w:pPr>
       <w:r>
@@ -212,7 +212,7 @@
           <w:rtl/>
           <w:szCs w:val="24"/>
         </w:rPr>
-        <w:t>בחורף לפני עשר שנים בערך, הייתי אז בן שתים עשרה, סבא שלי קרא לי לשבת לידו בשיג, אוהל האירוח של המשפחה. עד אז נכנסתי לשם רק כדי להביא משהו או לקרוא למישהו, כי ילדים לא יושבים עם הגברים. באותו ערב התארחו אצלנו קרובים מהמשפחה של דוד שלי, אולי חמישה עשר גברים, ובחוץ היה קר וחשוך. בפנים בערה אש קטנה בתוך גומה של חול, ולידה עמד הדלה, קנקן הקפה השחור.</w:t>
+        <w:t>בחורף לפני עשר שנים בערך, הייתי אז בן שתים עשרה, סבא שלי קרא לי לשבת לידו בשיג, אוהל האירוח של המשפחה. עד אז נכנסתי לשם רק כדי להביא משהו או לקרוא למישהו, כי ילדים לא יושבים עם הגברים. באותו ערב התארחו אצלנו קרובים מהמשפחה של דוד שלי, אולי חמישה עשר גברים, שבאו לדבר על אירוסין של אחד מבני הדודים. בחוץ היה קר וחשוך וירד הגשם הראשון של העונה, ובפנים בערה אש קטנה בתוך גומה של חול. ליד האש עמד הדלה, קנקן הקפה השחור והגבוה שאני מכיר מאז שאני זוכר את עצמי.</w:t>
       </w:r>
     </w:p>
     <w:p>
@@ -229,7 +229,7 @@
           <w:rtl/>
           <w:szCs w:val="24"/>
         </w:rPr>
-        <w:t>אני זוכר קודם כול את הריח. ריח של פולי קפה נקלים על מחבת ברזל, מעורבב עם הל ועם עשן של ענפי רותם. עד היום, כשאני מריח את הריח הזה, אני חוזר לרגע ההוא. סבא קלה את הפולים לאט, מנער את המחבת ביד רגועה, ואחר כך כתש אותם במכתש העץ. לכתישה יש קצב, כמעט מנגינה, וכל האוהל שתק כשהוא כתש. פתאום הוא הרים אליי את הראש ואמר: "תעאל יא רביע, היום אתה מוזג". חשבתי שלא שמעתי טוב.</w:t>
+        <w:t>אני זוכר קודם כול את הריח. ריח של פולי קפה נקלים על מחבת ברזל, מעורבב עם הל ועם עשן של ענפי רותם, ריח שנדבק בבגדים ולא יוצא גם אחרי כביסה. עד היום, כשאני מריח אותו איפשהו, אני חוזר לרגע ההוא. סבא קלה את הפולים לאט, מנער את המחבת ביד רגועה ובודק את הצבע שלהם מול האור. אחר כך הוא כתש אותם במכתש העץ. לכתישה יש קצב קבוע, כמעט מנגינה, וכל האוהל שתק כשהוא כתש. אומרים אצלנו שפעם הקצב הזה היה גם הזמנה: מי ששמע אותו מרחוק ידע שיש אורחים, ושמי שרוצה מוזמן לבוא. פתאום סבא הרים אליי את הראש ואמר: "תעאל יא רביע, היום אתה מוזג". חשבתי שלא שמעתי טוב.</w:t>
       </w:r>
     </w:p>
     <w:p>
@@ -246,7 +246,7 @@
           <w:rtl/>
           <w:szCs w:val="24"/>
         </w:rPr>
-        <w:t>הידיים שלי רעדו. את החוקים הכרתי בערך, מלראות, אבל באותו רגע הכול התערבב לי בראש. סבא דיבר אליי בשקט, כמעט בלחש: מחזיקים את הדלה ביד שמאל ואת הספלים ביד ימין. מוזגים מעט, שתיים שלוש לגימות, אף פעם לא ממלאים, כי ספל מלא הוא עלבון לאורח. מתחילים מהאורח המכובד ביותר וממשיכים ימינה. מי שמנער את הספל בסוף, סיים לשתות, ומי שמחזיר אותו בלי לנער, מבקש עוד.</w:t>
+        <w:t>הידיים שלי רעדו. את החוקים הכרתי בערך, מלראות, אבל באותו רגע הכול התערבב לי בראש. סבא דיבר אליי בשקט, כמעט בלחש, כדי שהאורחים לא ישמעו: מחזיקים את הדלה ביד שמאל ואת הספלים ביד ימין. מוזגים מעט, שתיים שלוש לגימות, אף פעם לא ממלאים, כי ספל מלא הוא עלבון לאורח. מתחילים מהאורח המכובד ביותר וממשיכים ימינה. מי שמנער את הספל בסוף, סיים לשתות, ומי שמחזיר אותו בלי לנער, מבקש עוד.</w:t>
       </w:r>
     </w:p>
     <w:p>
@@ -263,7 +263,24 @@
           <w:rtl/>
           <w:szCs w:val="24"/>
         </w:rPr>
-        <w:t>עברתי בין האנשים והלב דפק לי חזק. פחדתי לשפוך, פחדתי להתחיל מהאיש הלא נכון. ואז זקן אחד, חבר ותיק של סבא, לקח ממני את הספל, הביט בי רגע ארוך ואמר לסבא: "הנכד שלך כבר גבר". כולם צחקו, הפנים שלי בערו, אבל בפנים הרגשתי גאווה שקשה לי לתאר במילים. כשהאורחים הלכו, סבא הניח לי יד על הכתף ולא אמר כלום. זה היה מספיק.</w:t>
+        <w:t>עברתי בין האנשים והלב דפק לי חזק. פחדתי לשפוך, פחדתי להתחיל מהאיש הלא נכון, פחדתי שכולם רואים שהיד שלי רועדת. שמעתי את הגחלים מתפצחות, את הגשם על בד האוהל, מישהו צחק צחוק עמוק בקצה. ואז זקן אחד, חבר ותיק של סבא, לקח ממני את הספל, הביט בי רגע ארוך ואמר לסבא: "הנכד שלך כבר גבר". כולם צחקו, הפנים שלי בערו, אבל בפנים הרגשתי גאווה שקשה לי לתאר במילים.</w:t>
+      </w:r>
+    </w:p>
+    <w:p>
+      <w:pPr>
+        <w:bidi w:val="1"/>
+        <w:spacing w:line="480" w:lineRule="auto" w:before="0" w:after="0"/>
+        <w:jc w:val="both"/>
+      </w:pPr>
+      <w:r>
+        <w:rPr>
+          <w:rFonts w:ascii="David" w:hAnsi="David" w:cs="David"/>
+          <w:b w:val="0"/>
+          <w:sz w:val="24"/>
+          <w:rtl/>
+          <w:szCs w:val="24"/>
+        </w:rPr>
+        <w:t>כשהאורחים הלכו, כבר אחרי חצות, עזרתי לסבא לאסוף את הספלים. הוא לא אמר הרבה, רק הניח לי יד על הכתף ושתק. זה היה מספיק. בדרך הביתה חשבתי שמשהו השתנה באותו ערב, שנכנסתי למקום שעד אז רק הסתכלתי עליו מבחוץ. עד היום, כשאני שותה קהוה מרה, אני שומע את הכתישה ההיא.</w:t>
       </w:r>
     </w:p>
     <w:p>
@@ -274,7 +291,7 @@
     <w:p>
       <w:pPr>
         <w:bidi w:val="1"/>
-        <w:spacing w:line="480" w:lineRule="auto" w:before="0" w:after="200"/>
+        <w:spacing w:line="480" w:lineRule="auto" w:before="0" w:after="120"/>
         <w:jc w:val="right"/>
       </w:pPr>
       <w:r>
@@ -303,7 +320,7 @@
           <w:rtl/>
           <w:szCs w:val="24"/>
         </w:rPr>
-        <w:t>בתרגיל הראשון תיארתי את הערב שבו סבי הזמין אותי, בגיל שתים עשרה, למזוג לראשונה קפה לאורחים בשיג המשפחתי. תיארתי את קליית הפולים, את כללי המזיגה שסבי לחש לי, את הפחד לטעות, ואת הרגע שבו אחד הזקנים אמר עליי שאני "כבר גבר". באותו ערב חוויתי את המעמד כרגע אישי ומשפחתי מרגש. אבל כשאני מתבונן בו היום במבט סוציולוגי, אני מבין שהתרחש שם הרבה יותר מכוס קפה.</w:t>
+        <w:t>בתרגיל הראשון תיארתי את הערב שבו סבי הזמין אותי, בגיל שתים עשרה, למזוג לראשונה קפה לאורחים בשיג המשפחתי. תיארתי את קליית הפולים וכתישתם במכתש העץ, את כללי המזיגה המדויקים שסבי לחש לי, יד שמאל לדלה ויד ימין לספלים, מזיגה של מעט ולא ספל מלא, קודם כול המכובד שבאורחים, את הפחד שלי לטעות מול כולם, ואת הרגע שבו אחד הזקנים אמר עליי שאני "כבר גבר". באותו ערב חוויתי את המעמד כרגע אישי ומשפחתי מרגש. אבל כשאני קורא את הסיפור היום במבט סוציולוגי, אני מבין שהתרחש שם הרבה יותר מכוס קפה.</w:t>
       </w:r>
     </w:p>
     <w:p>
@@ -320,7 +337,7 @@
           <w:rtl/>
           <w:szCs w:val="24"/>
         </w:rPr>
-        <w:t>בחרתי לנתח את המקרה בעזרת שני מושגים שלמדנו: חיברות ונורמות תרבותיות. חיברות (סוציאליזציה) היא תהליך הלמידה החברתי שבו האדם רוכש את הערכים, הכללים ודפוסי ההתנהגות של החברה שהוא חי בה, וכך הופך מיצור ביולוגי לחבר מלא בקבוצה. התהליך הזה מתרחש דרך סוכני חיברות, ובראשם המשפחה. המושג השני קשור לתרבות: תרבות היא מכלול הידע, האמונות, המנהגים והסמלים שבאמצעותם קבוצה יוצרת משמעות משותפת, ונורמות הן כללי ההתנהגות המעשיים שמתרגמים ערכים מופשטים, כמו כבוד או הכנסת אורחים, למעשים יומיומיים.</w:t>
+        <w:t>בחרתי לנתח את המקרה בעזרת שני מושגים שלמדנו: חיברות ונורמות תרבותיות. חיברות (סוציאליזציה) היא תהליך הלמידה החברתי שבו האדם רוכש את הערכים, הכללים ודפוסי ההתנהגות של החברה שהוא חי בה, וכך הופך מיצור ביולוגי לחבר מלא בקבוצה. סיפורה של הילדה אנה, שגדלה בבידוד מוחלט, הראה לנו בשיעור עד כמה בלי התנסות חברתית אדם לא באמת מתפתח כאדם. התהליך מתחיל בילדות ונמשך לאורך כל החיים, והוא מתרחש דרך סוכני חיברות: קודם כול המשפחה, אבל גם בית הספר, קבוצת בני הגיל והתקשורת. המושג השני קשור לתרבות. תרבות היא מכלול הידע, האמונות, המנהגים והסמלים שבאמצעותם קבוצה יוצרת משמעות משותפת, ונורמות הן כללי ההתנהגות שמתרגמים ערכים מופשטים, כמו כבוד או הכנסת אורחים, למעשים יומיומיים. חשוב להבין שנורמה אינה "טבעית" ואינה מובנת מאליה: מה שנחשב מנומס בתרבות אחת יכול להיחשב פוגע בתרבות אחרת, ואדם לומד אותה בדיוק כמו שהוא לומד שפה.</w:t>
       </w:r>
     </w:p>
     <w:p>
@@ -337,7 +354,7 @@
           <w:rtl/>
           <w:szCs w:val="24"/>
         </w:rPr>
-        <w:t>כשמחברים את המושגים לסיפור, מתברר שהערב ההוא היה בעצם שיעור. סבי פעל כסוכן חיברות: הוא לא רק לימד אותי טכניקה של מזיגה, אלא העביר לי את הערכים של החברה הבדואית שגדלתי בה: כבוד לזקנים, הכנסת אורחים, ומקומו של כל אדם במעגל. כללי המזיגה עצמם הם נורמות תרבותיות: היד שמחזיקה את הדלה, הכמות שנמזגת, הסדר שבו ניגשים לאורחים. ספל מלא נחשב עלבון לא בגלל משהו טבעי בקפה, אלא בגלל משמעות שהקבוצה העניקה לו, ולכן הוא סמל תרבותי. גם המשפט "הנכד שלך כבר גבר" היה יותר ממחמאה. הוא היה אישור פומבי של הקבוצה לכך שעברתי שלב בתהליך החיברות שלי. מה שהרגשתי אז כגאווה אישית היה בעצם הדרך שבה החברה שלי משכפלת את עצמה ומעבירה את סדריה מדור לדור.</w:t>
+        <w:t>כשמחברים את המושגים לסיפור, מתברר שהערב ההוא היה בעצם שיעור. סבי פעל כסוכן חיברות: הוא לא רק לימד אותי טכניקה של מזיגה, אלא העביר לי, בלחש וליד האש, את הערכים של החברה הבדואית שגדלתי בה, כבוד לזקנים, הכנסת אורחים, ומקומו של כל אדם במעגל. כללי המזיגה עצמם הם נורמות תרבותיות לכל דבר: היד שמחזיקה את הדלה, הכמות שנמזגת, הסדר שבו ניגשים לאורחים. ספל מלא נחשב עלבון לא בגלל משהו טבעי בקפה, אלא בגלל המשמעות שהקבוצה העניקה לו, וזה בדיוק מה שהופך אותו לסמל תרבותי. גם המשפט "הנכד שלך כבר גבר" היה יותר ממחמאה: הוא היה אישור פומבי של הקבוצה לכך שעברתי בהצלחה שלב בתהליך החיברות שלי כגבר צעיר בחברה, מעין פיקוח חברתי עדין שמסמן לי מה מצופה ממני מעכשיו. בהקשר החברתי הרחב, הטקס הזה חוזר על עצמו בכל שיג ובכל דור, וכך המשפחה המורחבת שומרת על הסדר הפנימי שלה ומעבירה אותו הלאה. מה שהרגשתי אז כגאווה אישית ופרטית היה בעצם הדרך שבה החברה שלי משכפלת את עצמה ומעבירה את סדריה מדור לדור.</w:t>
       </w:r>
     </w:p>
     <w:sectPr>

</xml_diff>